<commit_message>
Store the templates unlocked
The four fillable Registrar forms are now kept unlocked in templates/
(Form 1 as .docx instead of the old .doc), so build.py fills them directly
without the Word XML unlock step. prepare.py stays for new or updated forms
that arrive locked, and build.py still unlocks a locked template if it gets
one. Field order is unchanged, so field-maps.md still applies.

Co-Authored-By: Claude Opus 5.5 <noreply@anthropic.com>
</commit_message>
<xml_diff>
--- a/templates/director-declaration.docx
+++ b/templates/director-declaration.docx
@@ -1,6 +1,6 @@
 
 <file path=word/document.xml><?xml version="1.0" encoding="utf-8"?>
-<w:document xmlns:wpc="http://schemas.microsoft.com/office/word/2010/wordprocessingCanvas" xmlns:cx="http://schemas.microsoft.com/office/drawing/2014/chartex" xmlns:cx1="http://schemas.microsoft.com/office/drawing/2015/9/8/chartex" xmlns:cx2="http://schemas.microsoft.com/office/drawing/2015/10/21/chartex" xmlns:cx3="http://schemas.microsoft.com/office/drawing/2016/5/9/chartex" xmlns:cx4="http://schemas.microsoft.com/office/drawing/2016/5/10/chartex" xmlns:cx5="http://schemas.microsoft.com/office/drawing/2016/5/11/chartex" xmlns:cx6="http://schemas.microsoft.com/office/drawing/2016/5/12/chartex" xmlns:cx7="http://schemas.microsoft.com/office/drawing/2016/5/13/chartex" xmlns:cx8="http://schemas.microsoft.com/office/drawing/2016/5/14/chartex" xmlns:mc="http://schemas.openxmlformats.org/markup-compatibility/2006" xmlns:aink="http://schemas.microsoft.com/office/drawing/2016/ink" xmlns:am3d="http://schemas.microsoft.com/office/drawing/2017/model3d" xmlns:o="urn:schemas-microsoft-com:office:office" xmlns:r="http://schemas.openxmlformats.org/officeDocument/2006/relationships" xmlns:m="http://schemas.openxmlformats.org/officeDocument/2006/math" xmlns:v="urn:schemas-microsoft-com:vml" xmlns:wp14="http://schemas.microsoft.com/office/word/2010/wordprocessingDrawing" xmlns:wp="http://schemas.openxmlformats.org/drawingml/2006/wordprocessingDrawing" xmlns:w10="urn:schemas-microsoft-com:office:word" xmlns:w="http://schemas.openxmlformats.org/wordprocessingml/2006/main" xmlns:w14="http://schemas.microsoft.com/office/word/2010/wordml" xmlns:w15="http://schemas.microsoft.com/office/word/2012/wordml" xmlns:w16cex="http://schemas.microsoft.com/office/word/2018/wordml/cex" xmlns:w16cid="http://schemas.microsoft.com/office/word/2016/wordml/cid" xmlns:w16="http://schemas.microsoft.com/office/word/2018/wordml" xmlns:w16sdtdh="http://schemas.microsoft.com/office/word/2020/wordml/sdtdatahash" xmlns:w16se="http://schemas.microsoft.com/office/word/2015/wordml/symex" xmlns:wpg="http://schemas.microsoft.com/office/word/2010/wordprocessingGroup" xmlns:wpi="http://schemas.microsoft.com/office/word/2010/wordprocessingInk" xmlns:wne="http://schemas.microsoft.com/office/word/2006/wordml" xmlns:wps="http://schemas.microsoft.com/office/word/2010/wordprocessingShape" mc:Ignorable="w14 w15 w16se w16cid w16 w16cex w16sdtdh wp14">
+<w:document xmlns:wpc="http://schemas.microsoft.com/office/word/2010/wordprocessingCanvas" xmlns:cx="http://schemas.microsoft.com/office/drawing/2014/chartex" xmlns:cx1="http://schemas.microsoft.com/office/drawing/2015/9/8/chartex" xmlns:cx2="http://schemas.microsoft.com/office/drawing/2015/10/21/chartex" xmlns:cx3="http://schemas.microsoft.com/office/drawing/2016/5/9/chartex" xmlns:cx4="http://schemas.microsoft.com/office/drawing/2016/5/10/chartex" xmlns:cx5="http://schemas.microsoft.com/office/drawing/2016/5/11/chartex" xmlns:cx6="http://schemas.microsoft.com/office/drawing/2016/5/12/chartex" xmlns:cx7="http://schemas.microsoft.com/office/drawing/2016/5/13/chartex" xmlns:cx8="http://schemas.microsoft.com/office/drawing/2016/5/14/chartex" xmlns:mc="http://schemas.openxmlformats.org/markup-compatibility/2006" xmlns:m="http://schemas.openxmlformats.org/officeDocument/2006/math" xmlns:aink="http://schemas.microsoft.com/office/drawing/2016/ink" xmlns:am3d="http://schemas.microsoft.com/office/drawing/2017/model3d" xmlns:oel="http://schemas.microsoft.com/office/2019/extlst" xmlns:r="http://schemas.openxmlformats.org/officeDocument/2006/relationships" xmlns:wp14="http://schemas.microsoft.com/office/word/2010/wordprocessingDrawing" xmlns:wp="http://schemas.openxmlformats.org/drawingml/2006/wordprocessingDrawing" xmlns:wpg="http://schemas.microsoft.com/office/word/2010/wordprocessingGroup" xmlns:wpi="http://schemas.microsoft.com/office/word/2010/wordprocessingInk" xmlns:wps="http://schemas.microsoft.com/office/word/2010/wordprocessingShape" xmlns:o="urn:schemas-microsoft-com:office:office" xmlns:v="urn:schemas-microsoft-com:vml" xmlns:w10="urn:schemas-microsoft-com:office:word" xmlns:w="http://schemas.openxmlformats.org/wordprocessingml/2006/main" xmlns:w14="http://schemas.microsoft.com/office/word/2010/wordml" xmlns:w15="http://schemas.microsoft.com/office/word/2012/wordml" xmlns:w16cex="http://schemas.microsoft.com/office/word/2018/wordml/cex" xmlns:w16cid="http://schemas.microsoft.com/office/word/2016/wordml/cid" xmlns:w16="http://schemas.microsoft.com/office/word/2018/wordml" xmlns:w16sdtdh="http://schemas.microsoft.com/office/word/2020/wordml/sdtdatahash" xmlns:w16sdtfl="http://schemas.microsoft.com/office/word/2024/wordml/sdtformatlock" xmlns:w16se="http://schemas.microsoft.com/office/word/2015/wordml/symex" xmlns:w16du="http://schemas.microsoft.com/office/word/2023/wordml/word16du" xmlns:wne="http://schemas.microsoft.com/office/word/2006/wordml" mc:Ignorable="w14 w15 w16se w16cid w16 w16cex w16sdtdh w16sdtfl w16du wp14">
   <w:body>
     <w:p>
       <w:pPr>
@@ -227,7 +227,6 @@
         <w:tc>
           <w:tcPr>
             <w:tcW w:w="8649" w:type="dxa"/>
-            <w:shd w:val="clear" w:color="auto" w:fill="auto"/>
           </w:tcPr>
           <w:permStart w:id="1431588590" w:edGrp="everyone"/>
           <w:p>
@@ -439,7 +438,6 @@
         <w:tc>
           <w:tcPr>
             <w:tcW w:w="3542" w:type="dxa"/>
-            <w:shd w:val="clear" w:color="auto" w:fill="auto"/>
           </w:tcPr>
           <w:p>
             <w:pPr>
@@ -465,7 +463,6 @@
         <w:tc>
           <w:tcPr>
             <w:tcW w:w="2969" w:type="dxa"/>
-            <w:shd w:val="clear" w:color="auto" w:fill="auto"/>
           </w:tcPr>
           <w:p>
             <w:pPr>
@@ -490,7 +487,6 @@
         <w:tc>
           <w:tcPr>
             <w:tcW w:w="3412" w:type="dxa"/>
-            <w:shd w:val="clear" w:color="auto" w:fill="auto"/>
           </w:tcPr>
           <w:p>
             <w:pPr>
@@ -530,7 +526,6 @@
         <w:tc>
           <w:tcPr>
             <w:tcW w:w="3542" w:type="dxa"/>
-            <w:shd w:val="clear" w:color="auto" w:fill="auto"/>
           </w:tcPr>
           <w:p>
             <w:pPr>
@@ -641,7 +636,6 @@
         <w:tc>
           <w:tcPr>
             <w:tcW w:w="2969" w:type="dxa"/>
-            <w:shd w:val="clear" w:color="auto" w:fill="auto"/>
           </w:tcPr>
           <w:p>
             <w:pPr>
@@ -752,7 +746,6 @@
         <w:tc>
           <w:tcPr>
             <w:tcW w:w="3412" w:type="dxa"/>
-            <w:shd w:val="clear" w:color="auto" w:fill="auto"/>
           </w:tcPr>
           <w:p>
             <w:pPr>
@@ -906,7 +899,6 @@
             <w:tcBorders>
               <w:bottom w:val="single" w:sz="4" w:space="0" w:color="auto"/>
             </w:tcBorders>
-            <w:shd w:val="clear" w:color="auto" w:fill="auto"/>
           </w:tcPr>
           <w:p>
             <w:pPr>
@@ -931,7 +923,6 @@
         <w:tc>
           <w:tcPr>
             <w:tcW w:w="2552" w:type="dxa"/>
-            <w:shd w:val="clear" w:color="auto" w:fill="auto"/>
           </w:tcPr>
           <w:p>
             <w:pPr>
@@ -974,7 +965,6 @@
             <w:tcBorders>
               <w:bottom w:val="single" w:sz="4" w:space="0" w:color="auto"/>
             </w:tcBorders>
-            <w:shd w:val="clear" w:color="auto" w:fill="auto"/>
           </w:tcPr>
           <w:p>
             <w:pPr>
@@ -1087,7 +1077,6 @@
         <w:tc>
           <w:tcPr>
             <w:tcW w:w="2552" w:type="dxa"/>
-            <w:shd w:val="clear" w:color="auto" w:fill="auto"/>
           </w:tcPr>
           <w:p>
             <w:pPr>
@@ -1264,7 +1253,6 @@
         <w:tc>
           <w:tcPr>
             <w:tcW w:w="1559" w:type="dxa"/>
-            <w:shd w:val="clear" w:color="auto" w:fill="auto"/>
           </w:tcPr>
           <w:p>
             <w:pPr>
@@ -1289,7 +1277,6 @@
         <w:tc>
           <w:tcPr>
             <w:tcW w:w="1418" w:type="dxa"/>
-            <w:shd w:val="clear" w:color="auto" w:fill="auto"/>
           </w:tcPr>
           <w:p>
             <w:pPr>
@@ -1314,7 +1301,6 @@
         <w:tc>
           <w:tcPr>
             <w:tcW w:w="1413" w:type="dxa"/>
-            <w:shd w:val="clear" w:color="auto" w:fill="auto"/>
           </w:tcPr>
           <w:p>
             <w:pPr>
@@ -1339,7 +1325,6 @@
         <w:tc>
           <w:tcPr>
             <w:tcW w:w="997" w:type="dxa"/>
-            <w:shd w:val="clear" w:color="auto" w:fill="auto"/>
           </w:tcPr>
           <w:p>
             <w:pPr>
@@ -1364,7 +1349,6 @@
         <w:tc>
           <w:tcPr>
             <w:tcW w:w="1275" w:type="dxa"/>
-            <w:shd w:val="clear" w:color="auto" w:fill="auto"/>
           </w:tcPr>
           <w:p>
             <w:pPr>
@@ -1389,7 +1373,6 @@
         <w:tc>
           <w:tcPr>
             <w:tcW w:w="1276" w:type="dxa"/>
-            <w:shd w:val="clear" w:color="auto" w:fill="auto"/>
           </w:tcPr>
           <w:p>
             <w:pPr>
@@ -1414,7 +1397,6 @@
         <w:tc>
           <w:tcPr>
             <w:tcW w:w="1985" w:type="dxa"/>
-            <w:shd w:val="clear" w:color="auto" w:fill="auto"/>
           </w:tcPr>
           <w:p>
             <w:pPr>
@@ -1445,7 +1427,6 @@
         <w:tc>
           <w:tcPr>
             <w:tcW w:w="1559" w:type="dxa"/>
-            <w:shd w:val="clear" w:color="auto" w:fill="auto"/>
           </w:tcPr>
           <w:p>
             <w:pPr>
@@ -1556,7 +1537,6 @@
         <w:tc>
           <w:tcPr>
             <w:tcW w:w="1418" w:type="dxa"/>
-            <w:shd w:val="clear" w:color="auto" w:fill="auto"/>
           </w:tcPr>
           <w:p>
             <w:pPr>
@@ -1667,7 +1647,6 @@
         <w:tc>
           <w:tcPr>
             <w:tcW w:w="1413" w:type="dxa"/>
-            <w:shd w:val="clear" w:color="auto" w:fill="auto"/>
           </w:tcPr>
           <w:p>
             <w:pPr>
@@ -1778,7 +1757,6 @@
         <w:tc>
           <w:tcPr>
             <w:tcW w:w="997" w:type="dxa"/>
-            <w:shd w:val="clear" w:color="auto" w:fill="auto"/>
           </w:tcPr>
           <w:p>
             <w:pPr>
@@ -1889,7 +1867,6 @@
         <w:tc>
           <w:tcPr>
             <w:tcW w:w="1275" w:type="dxa"/>
-            <w:shd w:val="clear" w:color="auto" w:fill="auto"/>
           </w:tcPr>
           <w:p>
             <w:pPr>
@@ -2000,7 +1977,6 @@
         <w:tc>
           <w:tcPr>
             <w:tcW w:w="1276" w:type="dxa"/>
-            <w:shd w:val="clear" w:color="auto" w:fill="auto"/>
           </w:tcPr>
           <w:p>
             <w:pPr>
@@ -2111,7 +2087,6 @@
         <w:tc>
           <w:tcPr>
             <w:tcW w:w="1985" w:type="dxa"/>
-            <w:shd w:val="clear" w:color="auto" w:fill="auto"/>
           </w:tcPr>
           <w:p>
             <w:pPr>
@@ -2606,7 +2581,6 @@
         <w:tc>
           <w:tcPr>
             <w:tcW w:w="3433" w:type="dxa"/>
-            <w:shd w:val="clear" w:color="auto" w:fill="auto"/>
           </w:tcPr>
           <w:p>
             <w:pPr>
@@ -2632,7 +2606,6 @@
         <w:tc>
           <w:tcPr>
             <w:tcW w:w="3020" w:type="dxa"/>
-            <w:shd w:val="clear" w:color="auto" w:fill="auto"/>
           </w:tcPr>
           <w:p>
             <w:pPr>
@@ -2657,7 +2630,6 @@
         <w:tc>
           <w:tcPr>
             <w:tcW w:w="3296" w:type="dxa"/>
-            <w:shd w:val="clear" w:color="auto" w:fill="auto"/>
           </w:tcPr>
           <w:p>
             <w:pPr>
@@ -2689,7 +2661,6 @@
         <w:tc>
           <w:tcPr>
             <w:tcW w:w="3433" w:type="dxa"/>
-            <w:shd w:val="clear" w:color="auto" w:fill="auto"/>
           </w:tcPr>
           <w:p>
             <w:pPr>
@@ -2800,7 +2771,6 @@
         <w:tc>
           <w:tcPr>
             <w:tcW w:w="3020" w:type="dxa"/>
-            <w:shd w:val="clear" w:color="auto" w:fill="auto"/>
           </w:tcPr>
           <w:p>
             <w:pPr>
@@ -2910,7 +2880,6 @@
         <w:tc>
           <w:tcPr>
             <w:tcW w:w="3296" w:type="dxa"/>
-            <w:shd w:val="clear" w:color="auto" w:fill="auto"/>
           </w:tcPr>
           <w:p>
             <w:pPr>
@@ -3316,7 +3285,6 @@
         <w:tc>
           <w:tcPr>
             <w:tcW w:w="0" w:type="auto"/>
-            <w:shd w:val="clear" w:color="auto" w:fill="auto"/>
           </w:tcPr>
           <w:p>
             <w:pPr>
@@ -3342,7 +3310,6 @@
             <w:tcBorders>
               <w:bottom w:val="single" w:sz="4" w:space="0" w:color="auto"/>
             </w:tcBorders>
-            <w:shd w:val="clear" w:color="auto" w:fill="auto"/>
           </w:tcPr>
           <w:p>
             <w:pPr>
@@ -3490,7 +3457,6 @@
         <w:tc>
           <w:tcPr>
             <w:tcW w:w="0" w:type="auto"/>
-            <w:shd w:val="clear" w:color="auto" w:fill="auto"/>
           </w:tcPr>
           <w:p>
             <w:pPr>
@@ -3517,7 +3483,6 @@
             <w:tcBorders>
               <w:bottom w:val="single" w:sz="4" w:space="0" w:color="auto"/>
             </w:tcBorders>
-            <w:shd w:val="clear" w:color="auto" w:fill="auto"/>
           </w:tcPr>
           <w:p>
             <w:pPr>
@@ -3657,7 +3622,6 @@
         <w:tc>
           <w:tcPr>
             <w:tcW w:w="5663" w:type="dxa"/>
-            <w:shd w:val="clear" w:color="auto" w:fill="auto"/>
           </w:tcPr>
           <w:p>
             <w:pPr>
@@ -3708,7 +3672,6 @@
             <w:tcBorders>
               <w:bottom w:val="single" w:sz="4" w:space="0" w:color="auto"/>
             </w:tcBorders>
-            <w:shd w:val="clear" w:color="auto" w:fill="auto"/>
           </w:tcPr>
           <w:p>
             <w:pPr>
@@ -3879,7 +3842,6 @@
           <w:tcPr>
             <w:tcW w:w="3534" w:type="dxa"/>
             <w:gridSpan w:val="2"/>
-            <w:shd w:val="clear" w:color="auto" w:fill="auto"/>
           </w:tcPr>
           <w:p>
             <w:pPr>
@@ -3913,7 +3875,6 @@
         <w:tc>
           <w:tcPr>
             <w:tcW w:w="1276" w:type="dxa"/>
-            <w:shd w:val="clear" w:color="auto" w:fill="auto"/>
           </w:tcPr>
           <w:p>
             <w:pPr>
@@ -3947,7 +3908,6 @@
         <w:tc>
           <w:tcPr>
             <w:tcW w:w="3198" w:type="dxa"/>
-            <w:shd w:val="clear" w:color="auto" w:fill="auto"/>
           </w:tcPr>
           <w:p>
             <w:pPr>
@@ -3980,7 +3940,6 @@
         <w:tc>
           <w:tcPr>
             <w:tcW w:w="1610" w:type="dxa"/>
-            <w:shd w:val="clear" w:color="auto" w:fill="auto"/>
           </w:tcPr>
           <w:p>
             <w:pPr>
@@ -4023,7 +3982,6 @@
         <w:tc>
           <w:tcPr>
             <w:tcW w:w="3108" w:type="dxa"/>
-            <w:shd w:val="clear" w:color="auto" w:fill="auto"/>
           </w:tcPr>
           <w:p>
             <w:pPr>
@@ -4154,7 +4112,6 @@
         <w:tc>
           <w:tcPr>
             <w:tcW w:w="1276" w:type="dxa"/>
-            <w:shd w:val="clear" w:color="auto" w:fill="auto"/>
           </w:tcPr>
           <w:p>
             <w:pPr>
@@ -4285,7 +4242,6 @@
         <w:tc>
           <w:tcPr>
             <w:tcW w:w="3198" w:type="dxa"/>
-            <w:shd w:val="clear" w:color="auto" w:fill="auto"/>
           </w:tcPr>
           <w:p>
             <w:pPr>
@@ -4416,7 +4372,6 @@
         <w:tc>
           <w:tcPr>
             <w:tcW w:w="1610" w:type="dxa"/>
-            <w:shd w:val="clear" w:color="auto" w:fill="auto"/>
           </w:tcPr>
           <w:p>
             <w:pPr>
@@ -4753,7 +4708,7 @@
 </file>
 
 <file path=word/endnotes.xml><?xml version="1.0" encoding="utf-8"?>
-<w:endnotes xmlns:wpc="http://schemas.microsoft.com/office/word/2010/wordprocessingCanvas" xmlns:cx="http://schemas.microsoft.com/office/drawing/2014/chartex" xmlns:cx1="http://schemas.microsoft.com/office/drawing/2015/9/8/chartex" xmlns:cx2="http://schemas.microsoft.com/office/drawing/2015/10/21/chartex" xmlns:cx3="http://schemas.microsoft.com/office/drawing/2016/5/9/chartex" xmlns:cx4="http://schemas.microsoft.com/office/drawing/2016/5/10/chartex" xmlns:cx5="http://schemas.microsoft.com/office/drawing/2016/5/11/chartex" xmlns:cx6="http://schemas.microsoft.com/office/drawing/2016/5/12/chartex" xmlns:cx7="http://schemas.microsoft.com/office/drawing/2016/5/13/chartex" xmlns:cx8="http://schemas.microsoft.com/office/drawing/2016/5/14/chartex" xmlns:mc="http://schemas.openxmlformats.org/markup-compatibility/2006" xmlns:aink="http://schemas.microsoft.com/office/drawing/2016/ink" xmlns:am3d="http://schemas.microsoft.com/office/drawing/2017/model3d" xmlns:o="urn:schemas-microsoft-com:office:office" xmlns:r="http://schemas.openxmlformats.org/officeDocument/2006/relationships" xmlns:m="http://schemas.openxmlformats.org/officeDocument/2006/math" xmlns:v="urn:schemas-microsoft-com:vml" xmlns:wp14="http://schemas.microsoft.com/office/word/2010/wordprocessingDrawing" xmlns:wp="http://schemas.openxmlformats.org/drawingml/2006/wordprocessingDrawing" xmlns:w10="urn:schemas-microsoft-com:office:word" xmlns:w="http://schemas.openxmlformats.org/wordprocessingml/2006/main" xmlns:w14="http://schemas.microsoft.com/office/word/2010/wordml" xmlns:w15="http://schemas.microsoft.com/office/word/2012/wordml" xmlns:w16cex="http://schemas.microsoft.com/office/word/2018/wordml/cex" xmlns:w16cid="http://schemas.microsoft.com/office/word/2016/wordml/cid" xmlns:w16="http://schemas.microsoft.com/office/word/2018/wordml" xmlns:w16sdtdh="http://schemas.microsoft.com/office/word/2020/wordml/sdtdatahash" xmlns:w16se="http://schemas.microsoft.com/office/word/2015/wordml/symex" xmlns:wpg="http://schemas.microsoft.com/office/word/2010/wordprocessingGroup" xmlns:wpi="http://schemas.microsoft.com/office/word/2010/wordprocessingInk" xmlns:wne="http://schemas.microsoft.com/office/word/2006/wordml" xmlns:wps="http://schemas.microsoft.com/office/word/2010/wordprocessingShape" mc:Ignorable="w14 w15 w16se w16cid w16 w16cex w16sdtdh wp14">
+<w:endnotes xmlns:wpc="http://schemas.microsoft.com/office/word/2010/wordprocessingCanvas" xmlns:cx="http://schemas.microsoft.com/office/drawing/2014/chartex" xmlns:cx1="http://schemas.microsoft.com/office/drawing/2015/9/8/chartex" xmlns:cx2="http://schemas.microsoft.com/office/drawing/2015/10/21/chartex" xmlns:cx3="http://schemas.microsoft.com/office/drawing/2016/5/9/chartex" xmlns:cx4="http://schemas.microsoft.com/office/drawing/2016/5/10/chartex" xmlns:cx5="http://schemas.microsoft.com/office/drawing/2016/5/11/chartex" xmlns:cx6="http://schemas.microsoft.com/office/drawing/2016/5/12/chartex" xmlns:cx7="http://schemas.microsoft.com/office/drawing/2016/5/13/chartex" xmlns:cx8="http://schemas.microsoft.com/office/drawing/2016/5/14/chartex" xmlns:mc="http://schemas.openxmlformats.org/markup-compatibility/2006" xmlns:m="http://schemas.openxmlformats.org/officeDocument/2006/math" xmlns:aink="http://schemas.microsoft.com/office/drawing/2016/ink" xmlns:am3d="http://schemas.microsoft.com/office/drawing/2017/model3d" xmlns:oel="http://schemas.microsoft.com/office/2019/extlst" xmlns:r="http://schemas.openxmlformats.org/officeDocument/2006/relationships" xmlns:wp14="http://schemas.microsoft.com/office/word/2010/wordprocessingDrawing" xmlns:wp="http://schemas.openxmlformats.org/drawingml/2006/wordprocessingDrawing" xmlns:wpg="http://schemas.microsoft.com/office/word/2010/wordprocessingGroup" xmlns:wpi="http://schemas.microsoft.com/office/word/2010/wordprocessingInk" xmlns:wps="http://schemas.microsoft.com/office/word/2010/wordprocessingShape" xmlns:o="urn:schemas-microsoft-com:office:office" xmlns:v="urn:schemas-microsoft-com:vml" xmlns:w10="urn:schemas-microsoft-com:office:word" xmlns:w="http://schemas.openxmlformats.org/wordprocessingml/2006/main" xmlns:w14="http://schemas.microsoft.com/office/word/2010/wordml" xmlns:w15="http://schemas.microsoft.com/office/word/2012/wordml" xmlns:w16cex="http://schemas.microsoft.com/office/word/2018/wordml/cex" xmlns:w16cid="http://schemas.microsoft.com/office/word/2016/wordml/cid" xmlns:w16="http://schemas.microsoft.com/office/word/2018/wordml" xmlns:w16sdtdh="http://schemas.microsoft.com/office/word/2020/wordml/sdtdatahash" xmlns:w16sdtfl="http://schemas.microsoft.com/office/word/2024/wordml/sdtformatlock" xmlns:w16se="http://schemas.microsoft.com/office/word/2015/wordml/symex" xmlns:w16du="http://schemas.microsoft.com/office/word/2023/wordml/word16du" xmlns:wne="http://schemas.microsoft.com/office/word/2006/wordml" mc:Ignorable="w14 w15 w16se w16cid w16 w16cex w16sdtdh w16sdtfl w16du wp14">
   <w:endnote w:type="separator" w:id="-1">
     <w:p>
       <w:pPr>
@@ -4778,7 +4733,7 @@
 </file>
 
 <file path=word/footer1.xml><?xml version="1.0" encoding="utf-8"?>
-<w:ftr xmlns:wpc="http://schemas.microsoft.com/office/word/2010/wordprocessingCanvas" xmlns:cx="http://schemas.microsoft.com/office/drawing/2014/chartex" xmlns:cx1="http://schemas.microsoft.com/office/drawing/2015/9/8/chartex" xmlns:cx2="http://schemas.microsoft.com/office/drawing/2015/10/21/chartex" xmlns:cx3="http://schemas.microsoft.com/office/drawing/2016/5/9/chartex" xmlns:cx4="http://schemas.microsoft.com/office/drawing/2016/5/10/chartex" xmlns:cx5="http://schemas.microsoft.com/office/drawing/2016/5/11/chartex" xmlns:cx6="http://schemas.microsoft.com/office/drawing/2016/5/12/chartex" xmlns:cx7="http://schemas.microsoft.com/office/drawing/2016/5/13/chartex" xmlns:cx8="http://schemas.microsoft.com/office/drawing/2016/5/14/chartex" xmlns:mc="http://schemas.openxmlformats.org/markup-compatibility/2006" xmlns:aink="http://schemas.microsoft.com/office/drawing/2016/ink" xmlns:am3d="http://schemas.microsoft.com/office/drawing/2017/model3d" xmlns:o="urn:schemas-microsoft-com:office:office" xmlns:r="http://schemas.openxmlformats.org/officeDocument/2006/relationships" xmlns:m="http://schemas.openxmlformats.org/officeDocument/2006/math" xmlns:v="urn:schemas-microsoft-com:vml" xmlns:wp14="http://schemas.microsoft.com/office/word/2010/wordprocessingDrawing" xmlns:wp="http://schemas.openxmlformats.org/drawingml/2006/wordprocessingDrawing" xmlns:w10="urn:schemas-microsoft-com:office:word" xmlns:w="http://schemas.openxmlformats.org/wordprocessingml/2006/main" xmlns:w14="http://schemas.microsoft.com/office/word/2010/wordml" xmlns:w15="http://schemas.microsoft.com/office/word/2012/wordml" xmlns:w16cex="http://schemas.microsoft.com/office/word/2018/wordml/cex" xmlns:w16cid="http://schemas.microsoft.com/office/word/2016/wordml/cid" xmlns:w16="http://schemas.microsoft.com/office/word/2018/wordml" xmlns:w16sdtdh="http://schemas.microsoft.com/office/word/2020/wordml/sdtdatahash" xmlns:w16se="http://schemas.microsoft.com/office/word/2015/wordml/symex" xmlns:wpg="http://schemas.microsoft.com/office/word/2010/wordprocessingGroup" xmlns:wpi="http://schemas.microsoft.com/office/word/2010/wordprocessingInk" xmlns:wne="http://schemas.microsoft.com/office/word/2006/wordml" xmlns:wps="http://schemas.microsoft.com/office/word/2010/wordprocessingShape" mc:Ignorable="w14 w15 w16se w16cid w16 w16cex w16sdtdh wp14">
+<w:ftr xmlns:wpc="http://schemas.microsoft.com/office/word/2010/wordprocessingCanvas" xmlns:cx="http://schemas.microsoft.com/office/drawing/2014/chartex" xmlns:cx1="http://schemas.microsoft.com/office/drawing/2015/9/8/chartex" xmlns:cx2="http://schemas.microsoft.com/office/drawing/2015/10/21/chartex" xmlns:cx3="http://schemas.microsoft.com/office/drawing/2016/5/9/chartex" xmlns:cx4="http://schemas.microsoft.com/office/drawing/2016/5/10/chartex" xmlns:cx5="http://schemas.microsoft.com/office/drawing/2016/5/11/chartex" xmlns:cx6="http://schemas.microsoft.com/office/drawing/2016/5/12/chartex" xmlns:cx7="http://schemas.microsoft.com/office/drawing/2016/5/13/chartex" xmlns:cx8="http://schemas.microsoft.com/office/drawing/2016/5/14/chartex" xmlns:mc="http://schemas.openxmlformats.org/markup-compatibility/2006" xmlns:m="http://schemas.openxmlformats.org/officeDocument/2006/math" xmlns:aink="http://schemas.microsoft.com/office/drawing/2016/ink" xmlns:am3d="http://schemas.microsoft.com/office/drawing/2017/model3d" xmlns:oel="http://schemas.microsoft.com/office/2019/extlst" xmlns:r="http://schemas.openxmlformats.org/officeDocument/2006/relationships" xmlns:wp14="http://schemas.microsoft.com/office/word/2010/wordprocessingDrawing" xmlns:wp="http://schemas.openxmlformats.org/drawingml/2006/wordprocessingDrawing" xmlns:wpg="http://schemas.microsoft.com/office/word/2010/wordprocessingGroup" xmlns:wpi="http://schemas.microsoft.com/office/word/2010/wordprocessingInk" xmlns:wps="http://schemas.microsoft.com/office/word/2010/wordprocessingShape" xmlns:o="urn:schemas-microsoft-com:office:office" xmlns:v="urn:schemas-microsoft-com:vml" xmlns:w10="urn:schemas-microsoft-com:office:word" xmlns:w="http://schemas.openxmlformats.org/wordprocessingml/2006/main" xmlns:w14="http://schemas.microsoft.com/office/word/2010/wordml" xmlns:w15="http://schemas.microsoft.com/office/word/2012/wordml" xmlns:w16cex="http://schemas.microsoft.com/office/word/2018/wordml/cex" xmlns:w16cid="http://schemas.microsoft.com/office/word/2016/wordml/cid" xmlns:w16="http://schemas.microsoft.com/office/word/2018/wordml" xmlns:w16sdtdh="http://schemas.microsoft.com/office/word/2020/wordml/sdtdatahash" xmlns:w16sdtfl="http://schemas.microsoft.com/office/word/2024/wordml/sdtformatlock" xmlns:w16se="http://schemas.microsoft.com/office/word/2015/wordml/symex" xmlns:w16du="http://schemas.microsoft.com/office/word/2023/wordml/word16du" xmlns:wne="http://schemas.microsoft.com/office/word/2006/wordml" mc:Ignorable="w14 w15 w16se w16cid w16 w16cex w16sdtdh w16sdtfl w16du wp14">
   <w:p>
     <w:pPr>
       <w:pStyle w:val="a5"/>
@@ -4979,7 +4934,7 @@
 </file>
 
 <file path=word/footnotes.xml><?xml version="1.0" encoding="utf-8"?>
-<w:footnotes xmlns:wpc="http://schemas.microsoft.com/office/word/2010/wordprocessingCanvas" xmlns:cx="http://schemas.microsoft.com/office/drawing/2014/chartex" xmlns:cx1="http://schemas.microsoft.com/office/drawing/2015/9/8/chartex" xmlns:cx2="http://schemas.microsoft.com/office/drawing/2015/10/21/chartex" xmlns:cx3="http://schemas.microsoft.com/office/drawing/2016/5/9/chartex" xmlns:cx4="http://schemas.microsoft.com/office/drawing/2016/5/10/chartex" xmlns:cx5="http://schemas.microsoft.com/office/drawing/2016/5/11/chartex" xmlns:cx6="http://schemas.microsoft.com/office/drawing/2016/5/12/chartex" xmlns:cx7="http://schemas.microsoft.com/office/drawing/2016/5/13/chartex" xmlns:cx8="http://schemas.microsoft.com/office/drawing/2016/5/14/chartex" xmlns:mc="http://schemas.openxmlformats.org/markup-compatibility/2006" xmlns:aink="http://schemas.microsoft.com/office/drawing/2016/ink" xmlns:am3d="http://schemas.microsoft.com/office/drawing/2017/model3d" xmlns:o="urn:schemas-microsoft-com:office:office" xmlns:r="http://schemas.openxmlformats.org/officeDocument/2006/relationships" xmlns:m="http://schemas.openxmlformats.org/officeDocument/2006/math" xmlns:v="urn:schemas-microsoft-com:vml" xmlns:wp14="http://schemas.microsoft.com/office/word/2010/wordprocessingDrawing" xmlns:wp="http://schemas.openxmlformats.org/drawingml/2006/wordprocessingDrawing" xmlns:w10="urn:schemas-microsoft-com:office:word" xmlns:w="http://schemas.openxmlformats.org/wordprocessingml/2006/main" xmlns:w14="http://schemas.microsoft.com/office/word/2010/wordml" xmlns:w15="http://schemas.microsoft.com/office/word/2012/wordml" xmlns:w16cex="http://schemas.microsoft.com/office/word/2018/wordml/cex" xmlns:w16cid="http://schemas.microsoft.com/office/word/2016/wordml/cid" xmlns:w16="http://schemas.microsoft.com/office/word/2018/wordml" xmlns:w16sdtdh="http://schemas.microsoft.com/office/word/2020/wordml/sdtdatahash" xmlns:w16se="http://schemas.microsoft.com/office/word/2015/wordml/symex" xmlns:wpg="http://schemas.microsoft.com/office/word/2010/wordprocessingGroup" xmlns:wpi="http://schemas.microsoft.com/office/word/2010/wordprocessingInk" xmlns:wne="http://schemas.microsoft.com/office/word/2006/wordml" xmlns:wps="http://schemas.microsoft.com/office/word/2010/wordprocessingShape" mc:Ignorable="w14 w15 w16se w16cid w16 w16cex w16sdtdh wp14">
+<w:footnotes xmlns:wpc="http://schemas.microsoft.com/office/word/2010/wordprocessingCanvas" xmlns:cx="http://schemas.microsoft.com/office/drawing/2014/chartex" xmlns:cx1="http://schemas.microsoft.com/office/drawing/2015/9/8/chartex" xmlns:cx2="http://schemas.microsoft.com/office/drawing/2015/10/21/chartex" xmlns:cx3="http://schemas.microsoft.com/office/drawing/2016/5/9/chartex" xmlns:cx4="http://schemas.microsoft.com/office/drawing/2016/5/10/chartex" xmlns:cx5="http://schemas.microsoft.com/office/drawing/2016/5/11/chartex" xmlns:cx6="http://schemas.microsoft.com/office/drawing/2016/5/12/chartex" xmlns:cx7="http://schemas.microsoft.com/office/drawing/2016/5/13/chartex" xmlns:cx8="http://schemas.microsoft.com/office/drawing/2016/5/14/chartex" xmlns:mc="http://schemas.openxmlformats.org/markup-compatibility/2006" xmlns:m="http://schemas.openxmlformats.org/officeDocument/2006/math" xmlns:aink="http://schemas.microsoft.com/office/drawing/2016/ink" xmlns:am3d="http://schemas.microsoft.com/office/drawing/2017/model3d" xmlns:oel="http://schemas.microsoft.com/office/2019/extlst" xmlns:r="http://schemas.openxmlformats.org/officeDocument/2006/relationships" xmlns:wp14="http://schemas.microsoft.com/office/word/2010/wordprocessingDrawing" xmlns:wp="http://schemas.openxmlformats.org/drawingml/2006/wordprocessingDrawing" xmlns:wpg="http://schemas.microsoft.com/office/word/2010/wordprocessingGroup" xmlns:wpi="http://schemas.microsoft.com/office/word/2010/wordprocessingInk" xmlns:wps="http://schemas.microsoft.com/office/word/2010/wordprocessingShape" xmlns:o="urn:schemas-microsoft-com:office:office" xmlns:v="urn:schemas-microsoft-com:vml" xmlns:w10="urn:schemas-microsoft-com:office:word" xmlns:w="http://schemas.openxmlformats.org/wordprocessingml/2006/main" xmlns:w14="http://schemas.microsoft.com/office/word/2010/wordml" xmlns:w15="http://schemas.microsoft.com/office/word/2012/wordml" xmlns:w16cex="http://schemas.microsoft.com/office/word/2018/wordml/cex" xmlns:w16cid="http://schemas.microsoft.com/office/word/2016/wordml/cid" xmlns:w16="http://schemas.microsoft.com/office/word/2018/wordml" xmlns:w16sdtdh="http://schemas.microsoft.com/office/word/2020/wordml/sdtdatahash" xmlns:w16sdtfl="http://schemas.microsoft.com/office/word/2024/wordml/sdtformatlock" xmlns:w16se="http://schemas.microsoft.com/office/word/2015/wordml/symex" xmlns:w16du="http://schemas.microsoft.com/office/word/2023/wordml/word16du" xmlns:wne="http://schemas.microsoft.com/office/word/2006/wordml" mc:Ignorable="w14 w15 w16se w16cid w16 w16cex w16sdtdh w16sdtfl w16du wp14">
   <w:footnote w:type="separator" w:id="-1">
     <w:p>
       <w:pPr>
@@ -5127,7 +5082,27 @@
           <w:szCs w:val="20"/>
           <w:rtl/>
         </w:rPr>
-        <w:t>(דיווח, פרטי רישום וטפסים), התש"ס 1999.</w:t>
+        <w:t xml:space="preserve">(דיווח, פרטי רישום וטפסים), </w:t>
+      </w:r>
+      <w:proofErr w:type="spellStart"/>
+      <w:r>
+        <w:rPr>
+          <w:rFonts w:ascii="Times New Roman" w:eastAsia="Times New Roman" w:hAnsi="Times New Roman" w:cs="David"/>
+          <w:sz w:val="20"/>
+          <w:szCs w:val="20"/>
+          <w:rtl/>
+        </w:rPr>
+        <w:t>התש"ס</w:t>
+      </w:r>
+      <w:proofErr w:type="spellEnd"/>
+      <w:r>
+        <w:rPr>
+          <w:rFonts w:ascii="Times New Roman" w:eastAsia="Times New Roman" w:hAnsi="Times New Roman" w:cs="David"/>
+          <w:sz w:val="20"/>
+          <w:szCs w:val="20"/>
+          <w:rtl/>
+        </w:rPr>
+        <w:t xml:space="preserve"> 1999.</w:t>
       </w:r>
     </w:p>
   </w:footnote>
@@ -5170,7 +5145,27 @@
           <w:szCs w:val="20"/>
           <w:rtl/>
         </w:rPr>
-        <w:t xml:space="preserve">היה בעל המניות תאגיד, יצויין מס' </w:t>
+        <w:t xml:space="preserve">היה בעל המניות תאגיד, </w:t>
+      </w:r>
+      <w:proofErr w:type="spellStart"/>
+      <w:r>
+        <w:rPr>
+          <w:rFonts w:ascii="Times New Roman" w:eastAsia="Times New Roman" w:hAnsi="Times New Roman" w:cs="David"/>
+          <w:sz w:val="20"/>
+          <w:szCs w:val="20"/>
+          <w:rtl/>
+        </w:rPr>
+        <w:t>יצויין</w:t>
+      </w:r>
+      <w:proofErr w:type="spellEnd"/>
+      <w:r>
+        <w:rPr>
+          <w:rFonts w:ascii="Times New Roman" w:eastAsia="Times New Roman" w:hAnsi="Times New Roman" w:cs="David"/>
+          <w:sz w:val="20"/>
+          <w:szCs w:val="20"/>
+          <w:rtl/>
+        </w:rPr>
+        <w:t xml:space="preserve"> מס' </w:t>
       </w:r>
       <w:r>
         <w:rPr>
@@ -5269,7 +5264,14 @@
           <w:rFonts w:cs="David"/>
           <w:rtl/>
         </w:rPr>
-        <w:t xml:space="preserve"> היה הדירקטור תאגיד, יחתום מי שמוסמך לכך מטעם התאגיד בציון שמו של החותם ומספר תעודת הזהות שלו.</w:t>
+        <w:t xml:space="preserve"> </w:t>
+      </w:r>
+      <w:r>
+        <w:rPr>
+          <w:rFonts w:cs="David"/>
+          <w:rtl/>
+        </w:rPr>
+        <w:t>היה הדירקטור תאגיד, יחתום מי שמוסמך לכך מטעם התאגיד בציון שמו של החותם ומספר תעודת הזהות שלו.</w:t>
       </w:r>
     </w:p>
   </w:footnote>
@@ -5277,7 +5279,7 @@
 </file>
 
 <file path=word/header1.xml><?xml version="1.0" encoding="utf-8"?>
-<w:hdr xmlns:wpc="http://schemas.microsoft.com/office/word/2010/wordprocessingCanvas" xmlns:cx="http://schemas.microsoft.com/office/drawing/2014/chartex" xmlns:cx1="http://schemas.microsoft.com/office/drawing/2015/9/8/chartex" xmlns:cx2="http://schemas.microsoft.com/office/drawing/2015/10/21/chartex" xmlns:cx3="http://schemas.microsoft.com/office/drawing/2016/5/9/chartex" xmlns:cx4="http://schemas.microsoft.com/office/drawing/2016/5/10/chartex" xmlns:cx5="http://schemas.microsoft.com/office/drawing/2016/5/11/chartex" xmlns:cx6="http://schemas.microsoft.com/office/drawing/2016/5/12/chartex" xmlns:cx7="http://schemas.microsoft.com/office/drawing/2016/5/13/chartex" xmlns:cx8="http://schemas.microsoft.com/office/drawing/2016/5/14/chartex" xmlns:mc="http://schemas.openxmlformats.org/markup-compatibility/2006" xmlns:aink="http://schemas.microsoft.com/office/drawing/2016/ink" xmlns:am3d="http://schemas.microsoft.com/office/drawing/2017/model3d" xmlns:o="urn:schemas-microsoft-com:office:office" xmlns:r="http://schemas.openxmlformats.org/officeDocument/2006/relationships" xmlns:m="http://schemas.openxmlformats.org/officeDocument/2006/math" xmlns:v="urn:schemas-microsoft-com:vml" xmlns:wp14="http://schemas.microsoft.com/office/word/2010/wordprocessingDrawing" xmlns:wp="http://schemas.openxmlformats.org/drawingml/2006/wordprocessingDrawing" xmlns:w10="urn:schemas-microsoft-com:office:word" xmlns:w="http://schemas.openxmlformats.org/wordprocessingml/2006/main" xmlns:w14="http://schemas.microsoft.com/office/word/2010/wordml" xmlns:w15="http://schemas.microsoft.com/office/word/2012/wordml" xmlns:w16cex="http://schemas.microsoft.com/office/word/2018/wordml/cex" xmlns:w16cid="http://schemas.microsoft.com/office/word/2016/wordml/cid" xmlns:w16="http://schemas.microsoft.com/office/word/2018/wordml" xmlns:w16sdtdh="http://schemas.microsoft.com/office/word/2020/wordml/sdtdatahash" xmlns:w16se="http://schemas.microsoft.com/office/word/2015/wordml/symex" xmlns:wpg="http://schemas.microsoft.com/office/word/2010/wordprocessingGroup" xmlns:wpi="http://schemas.microsoft.com/office/word/2010/wordprocessingInk" xmlns:wne="http://schemas.microsoft.com/office/word/2006/wordml" xmlns:wps="http://schemas.microsoft.com/office/word/2010/wordprocessingShape" mc:Ignorable="w14 w15 w16se w16cid w16 w16cex w16sdtdh wp14">
+<w:hdr xmlns:wpc="http://schemas.microsoft.com/office/word/2010/wordprocessingCanvas" xmlns:cx="http://schemas.microsoft.com/office/drawing/2014/chartex" xmlns:cx1="http://schemas.microsoft.com/office/drawing/2015/9/8/chartex" xmlns:cx2="http://schemas.microsoft.com/office/drawing/2015/10/21/chartex" xmlns:cx3="http://schemas.microsoft.com/office/drawing/2016/5/9/chartex" xmlns:cx4="http://schemas.microsoft.com/office/drawing/2016/5/10/chartex" xmlns:cx5="http://schemas.microsoft.com/office/drawing/2016/5/11/chartex" xmlns:cx6="http://schemas.microsoft.com/office/drawing/2016/5/12/chartex" xmlns:cx7="http://schemas.microsoft.com/office/drawing/2016/5/13/chartex" xmlns:cx8="http://schemas.microsoft.com/office/drawing/2016/5/14/chartex" xmlns:mc="http://schemas.openxmlformats.org/markup-compatibility/2006" xmlns:m="http://schemas.openxmlformats.org/officeDocument/2006/math" xmlns:aink="http://schemas.microsoft.com/office/drawing/2016/ink" xmlns:am3d="http://schemas.microsoft.com/office/drawing/2017/model3d" xmlns:oel="http://schemas.microsoft.com/office/2019/extlst" xmlns:r="http://schemas.openxmlformats.org/officeDocument/2006/relationships" xmlns:wp14="http://schemas.microsoft.com/office/word/2010/wordprocessingDrawing" xmlns:wp="http://schemas.openxmlformats.org/drawingml/2006/wordprocessingDrawing" xmlns:wpg="http://schemas.microsoft.com/office/word/2010/wordprocessingGroup" xmlns:wpi="http://schemas.microsoft.com/office/word/2010/wordprocessingInk" xmlns:wps="http://schemas.microsoft.com/office/word/2010/wordprocessingShape" xmlns:o="urn:schemas-microsoft-com:office:office" xmlns:v="urn:schemas-microsoft-com:vml" xmlns:w10="urn:schemas-microsoft-com:office:word" xmlns:w="http://schemas.openxmlformats.org/wordprocessingml/2006/main" xmlns:w14="http://schemas.microsoft.com/office/word/2010/wordml" xmlns:w15="http://schemas.microsoft.com/office/word/2012/wordml" xmlns:w16cex="http://schemas.microsoft.com/office/word/2018/wordml/cex" xmlns:w16cid="http://schemas.microsoft.com/office/word/2016/wordml/cid" xmlns:w16="http://schemas.microsoft.com/office/word/2018/wordml" xmlns:w16sdtdh="http://schemas.microsoft.com/office/word/2020/wordml/sdtdatahash" xmlns:w16sdtfl="http://schemas.microsoft.com/office/word/2024/wordml/sdtformatlock" xmlns:w16se="http://schemas.microsoft.com/office/word/2015/wordml/symex" xmlns:w16du="http://schemas.microsoft.com/office/word/2023/wordml/word16du" xmlns:wne="http://schemas.microsoft.com/office/word/2006/wordml" mc:Ignorable="w14 w15 w16se w16cid w16 w16cex w16sdtdh w16sdtfl w16du wp14">
   <w:p>
     <w:pPr>
       <w:keepLines/>
@@ -5326,7 +5328,6 @@
       <w:tc>
         <w:tcPr>
           <w:tcW w:w="3045" w:type="dxa"/>
-          <w:shd w:val="clear" w:color="auto" w:fill="auto"/>
         </w:tcPr>
         <w:p>
           <w:pPr>
@@ -5409,7 +5410,6 @@
       <w:tc>
         <w:tcPr>
           <w:tcW w:w="3045" w:type="dxa"/>
-          <w:shd w:val="clear" w:color="auto" w:fill="auto"/>
         </w:tcPr>
         <w:p>
           <w:pPr>
@@ -5549,7 +5549,6 @@
       <w:tc>
         <w:tcPr>
           <w:tcW w:w="3045" w:type="dxa"/>
-          <w:shd w:val="clear" w:color="auto" w:fill="auto"/>
         </w:tcPr>
         <w:p>
           <w:pPr>
@@ -5656,7 +5655,7 @@
 </file>
 
 <file path=word/numbering.xml><?xml version="1.0" encoding="utf-8"?>
-<w:numbering xmlns:wpc="http://schemas.microsoft.com/office/word/2010/wordprocessingCanvas" xmlns:cx="http://schemas.microsoft.com/office/drawing/2014/chartex" xmlns:cx1="http://schemas.microsoft.com/office/drawing/2015/9/8/chartex" xmlns:cx2="http://schemas.microsoft.com/office/drawing/2015/10/21/chartex" xmlns:cx3="http://schemas.microsoft.com/office/drawing/2016/5/9/chartex" xmlns:cx4="http://schemas.microsoft.com/office/drawing/2016/5/10/chartex" xmlns:cx5="http://schemas.microsoft.com/office/drawing/2016/5/11/chartex" xmlns:cx6="http://schemas.microsoft.com/office/drawing/2016/5/12/chartex" xmlns:cx7="http://schemas.microsoft.com/office/drawing/2016/5/13/chartex" xmlns:cx8="http://schemas.microsoft.com/office/drawing/2016/5/14/chartex" xmlns:mc="http://schemas.openxmlformats.org/markup-compatibility/2006" xmlns:aink="http://schemas.microsoft.com/office/drawing/2016/ink" xmlns:am3d="http://schemas.microsoft.com/office/drawing/2017/model3d" xmlns:o="urn:schemas-microsoft-com:office:office" xmlns:r="http://schemas.openxmlformats.org/officeDocument/2006/relationships" xmlns:m="http://schemas.openxmlformats.org/officeDocument/2006/math" xmlns:v="urn:schemas-microsoft-com:vml" xmlns:wp14="http://schemas.microsoft.com/office/word/2010/wordprocessingDrawing" xmlns:wp="http://schemas.openxmlformats.org/drawingml/2006/wordprocessingDrawing" xmlns:w10="urn:schemas-microsoft-com:office:word" xmlns:w="http://schemas.openxmlformats.org/wordprocessingml/2006/main" xmlns:w14="http://schemas.microsoft.com/office/word/2010/wordml" xmlns:w15="http://schemas.microsoft.com/office/word/2012/wordml" xmlns:w16cex="http://schemas.microsoft.com/office/word/2018/wordml/cex" xmlns:w16cid="http://schemas.microsoft.com/office/word/2016/wordml/cid" xmlns:w16="http://schemas.microsoft.com/office/word/2018/wordml" xmlns:w16sdtdh="http://schemas.microsoft.com/office/word/2020/wordml/sdtdatahash" xmlns:w16se="http://schemas.microsoft.com/office/word/2015/wordml/symex" xmlns:wpg="http://schemas.microsoft.com/office/word/2010/wordprocessingGroup" xmlns:wpi="http://schemas.microsoft.com/office/word/2010/wordprocessingInk" xmlns:wne="http://schemas.microsoft.com/office/word/2006/wordml" xmlns:wps="http://schemas.microsoft.com/office/word/2010/wordprocessingShape" mc:Ignorable="w14 w15 w16se w16cid w16 w16cex w16sdtdh wp14">
+<w:numbering xmlns:wpc="http://schemas.microsoft.com/office/word/2010/wordprocessingCanvas" xmlns:cx="http://schemas.microsoft.com/office/drawing/2014/chartex" xmlns:cx1="http://schemas.microsoft.com/office/drawing/2015/9/8/chartex" xmlns:cx2="http://schemas.microsoft.com/office/drawing/2015/10/21/chartex" xmlns:cx3="http://schemas.microsoft.com/office/drawing/2016/5/9/chartex" xmlns:cx4="http://schemas.microsoft.com/office/drawing/2016/5/10/chartex" xmlns:cx5="http://schemas.microsoft.com/office/drawing/2016/5/11/chartex" xmlns:cx6="http://schemas.microsoft.com/office/drawing/2016/5/12/chartex" xmlns:cx7="http://schemas.microsoft.com/office/drawing/2016/5/13/chartex" xmlns:cx8="http://schemas.microsoft.com/office/drawing/2016/5/14/chartex" xmlns:mc="http://schemas.openxmlformats.org/markup-compatibility/2006" xmlns:m="http://schemas.openxmlformats.org/officeDocument/2006/math" xmlns:aink="http://schemas.microsoft.com/office/drawing/2016/ink" xmlns:am3d="http://schemas.microsoft.com/office/drawing/2017/model3d" xmlns:oel="http://schemas.microsoft.com/office/2019/extlst" xmlns:r="http://schemas.openxmlformats.org/officeDocument/2006/relationships" xmlns:wp14="http://schemas.microsoft.com/office/word/2010/wordprocessingDrawing" xmlns:wp="http://schemas.openxmlformats.org/drawingml/2006/wordprocessingDrawing" xmlns:wpg="http://schemas.microsoft.com/office/word/2010/wordprocessingGroup" xmlns:wpi="http://schemas.microsoft.com/office/word/2010/wordprocessingInk" xmlns:wps="http://schemas.microsoft.com/office/word/2010/wordprocessingShape" xmlns:o="urn:schemas-microsoft-com:office:office" xmlns:v="urn:schemas-microsoft-com:vml" xmlns:w10="urn:schemas-microsoft-com:office:word" xmlns:w="http://schemas.openxmlformats.org/wordprocessingml/2006/main" xmlns:w14="http://schemas.microsoft.com/office/word/2010/wordml" xmlns:w15="http://schemas.microsoft.com/office/word/2012/wordml" xmlns:w16cex="http://schemas.microsoft.com/office/word/2018/wordml/cex" xmlns:w16cid="http://schemas.microsoft.com/office/word/2016/wordml/cid" xmlns:w16="http://schemas.microsoft.com/office/word/2018/wordml" xmlns:w16sdtdh="http://schemas.microsoft.com/office/word/2020/wordml/sdtdatahash" xmlns:w16sdtfl="http://schemas.microsoft.com/office/word/2024/wordml/sdtformatlock" xmlns:w16se="http://schemas.microsoft.com/office/word/2015/wordml/symex" xmlns:w16du="http://schemas.microsoft.com/office/word/2023/wordml/word16du" xmlns:wne="http://schemas.microsoft.com/office/word/2006/wordml" mc:Ignorable="w14 w15 w16se w16cid w16 w16cex w16sdtdh w16sdtfl w16du wp14">
   <w:abstractNum w:abstractNumId="0" w15:restartNumberingAfterBreak="0">
     <w:nsid w:val="02617C01"/>
     <w:multiLevelType w:val="hybridMultilevel"/>
@@ -6064,32 +6063,32 @@
       </w:pPr>
     </w:lvl>
   </w:abstractNum>
-  <w:num w:numId="1">
+  <w:num w:numId="1" w16cid:durableId="766536548">
     <w:abstractNumId w:val="3"/>
   </w:num>
-  <w:num w:numId="2">
+  <w:num w:numId="2" w16cid:durableId="1299922959">
     <w:abstractNumId w:val="2"/>
   </w:num>
-  <w:num w:numId="3">
+  <w:num w:numId="3" w16cid:durableId="1467120178">
     <w:abstractNumId w:val="0"/>
   </w:num>
-  <w:num w:numId="4">
+  <w:num w:numId="4" w16cid:durableId="1237204426">
     <w:abstractNumId w:val="5"/>
   </w:num>
-  <w:num w:numId="5">
+  <w:num w:numId="5" w16cid:durableId="76900969">
     <w:abstractNumId w:val="4"/>
   </w:num>
-  <w:num w:numId="6">
+  <w:num w:numId="6" w16cid:durableId="2017151717">
     <w:abstractNumId w:val="6"/>
   </w:num>
-  <w:num w:numId="7">
+  <w:num w:numId="7" w16cid:durableId="82991134">
     <w:abstractNumId w:val="1"/>
   </w:num>
 </w:numbering>
 </file>
 
 <file path=word/styles.xml><?xml version="1.0" encoding="utf-8"?>
-<w:styles xmlns:mc="http://schemas.openxmlformats.org/markup-compatibility/2006" xmlns:r="http://schemas.openxmlformats.org/officeDocument/2006/relationships" xmlns:w="http://schemas.openxmlformats.org/wordprocessingml/2006/main" xmlns:w14="http://schemas.microsoft.com/office/word/2010/wordml" xmlns:w15="http://schemas.microsoft.com/office/word/2012/wordml" xmlns:w16cex="http://schemas.microsoft.com/office/word/2018/wordml/cex" xmlns:w16cid="http://schemas.microsoft.com/office/word/2016/wordml/cid" xmlns:w16="http://schemas.microsoft.com/office/word/2018/wordml" xmlns:w16sdtdh="http://schemas.microsoft.com/office/word/2020/wordml/sdtdatahash" xmlns:w16se="http://schemas.microsoft.com/office/word/2015/wordml/symex" mc:Ignorable="w14 w15 w16se w16cid w16 w16cex w16sdtdh">
+<w:styles xmlns:mc="http://schemas.openxmlformats.org/markup-compatibility/2006" xmlns:r="http://schemas.openxmlformats.org/officeDocument/2006/relationships" xmlns:w="http://schemas.openxmlformats.org/wordprocessingml/2006/main" xmlns:w14="http://schemas.microsoft.com/office/word/2010/wordml" xmlns:w15="http://schemas.microsoft.com/office/word/2012/wordml" xmlns:w16cex="http://schemas.microsoft.com/office/word/2018/wordml/cex" xmlns:w16cid="http://schemas.microsoft.com/office/word/2016/wordml/cid" xmlns:w16="http://schemas.microsoft.com/office/word/2018/wordml" xmlns:w16sdtdh="http://schemas.microsoft.com/office/word/2020/wordml/sdtdatahash" xmlns:w16sdtfl="http://schemas.microsoft.com/office/word/2024/wordml/sdtformatlock" xmlns:w16se="http://schemas.microsoft.com/office/word/2015/wordml/symex" xmlns:w16du="http://schemas.microsoft.com/office/word/2023/wordml/word16du" mc:Ignorable="w14 w15 w16se w16cid w16 w16cex w16sdtdh w16sdtfl w16du">
   <w:docDefaults>
     <w:rPrDefault>
       <w:rPr>
@@ -7432,16 +7431,10 @@
 <file path=customXml/itemProps4.xml><?xml version="1.0" encoding="utf-8"?>
 <ds:datastoreItem xmlns:ds="http://schemas.openxmlformats.org/officeDocument/2006/customXml" ds:itemID="{21F858C8-37CA-4575-886D-AD52C2E802E2}">
   <ds:schemaRefs>
-    <ds:schemaRef ds:uri="http://purl.org/dc/terms/"/>
+    <ds:schemaRef ds:uri="http://schemas.microsoft.com/office/2006/metadata/properties"/>
+    <ds:schemaRef ds:uri="http://schemas.microsoft.com/office/infopath/2007/PartnerControls"/>
     <ds:schemaRef ds:uri="605e85f2-268e-450d-9afb-d305d42b267e"/>
-    <ds:schemaRef ds:uri="http://schemas.microsoft.com/office/2006/documentManagement/types"/>
-    <ds:schemaRef ds:uri="http://schemas.openxmlformats.org/package/2006/metadata/core-properties"/>
-    <ds:schemaRef ds:uri="http://purl.org/dc/elements/1.1/"/>
-    <ds:schemaRef ds:uri="http://schemas.microsoft.com/office/2006/metadata/properties"/>
     <ds:schemaRef ds:uri="http://schemas.microsoft.com/sharepoint/v3"/>
-    <ds:schemaRef ds:uri="http://schemas.microsoft.com/office/infopath/2007/PartnerControls"/>
-    <ds:schemaRef ds:uri="http://www.w3.org/XML/1998/namespace"/>
-    <ds:schemaRef ds:uri="http://purl.org/dc/dcmitype/"/>
   </ds:schemaRefs>
 </ds:datastoreItem>
 </file>
</xml_diff>